<commit_message>
atualiza documentacao - detalha SCD Type 2
</commit_message>
<xml_diff>
--- a/docs/Documentacao_FastTrack2.docx
+++ b/docs/Documentacao_FastTrack2.docx
@@ -8316,6 +8316,287 @@
           <w:szCs w:val="22"/>
         </w:rPr>
         <w:t xml:space="preserve">Ao final, execute list_tables() em qualquer notebook para verificar as 44 tabelas Delta criadas nas três camadas.</w:t>
+      </w:r>
+    </w:p>
+    <w:p>
+      <w:pPr>
+        <w:pStyle w:val="Heading1"/>
+        <w:spacing w:after="200" w:before="360"/>
+      </w:pPr>
+      <w:r>
+        <w:rPr>
+          <w:rFonts w:ascii="Arial" w:cs="Arial" w:eastAsia="Arial" w:hAnsi="Arial"/>
+          <w:b/>
+          <w:bCs/>
+          <w:color w:val="1F4E79"/>
+          <w:sz w:val="32"/>
+          <w:szCs w:val="32"/>
+        </w:rPr>
+        <w:t xml:space="preserve">10. Material de Apoio — Arquivos CSV</w:t>
+      </w:r>
+    </w:p>
+    <w:p>
+      <w:pPr>
+        <w:spacing w:after="120" w:before="80"/>
+      </w:pPr>
+      <w:r>
+        <w:rPr>
+          <w:rFonts w:ascii="Arial" w:cs="Arial" w:eastAsia="Arial" w:hAnsi="Arial"/>
+          <w:sz w:val="22"/>
+          <w:szCs w:val="22"/>
+        </w:rPr>
+        <w:t xml:space="preserve">Na pasta /resultados do repositório GitHub estão disponíveis 9 arquivos CSV exportados das principais tabelas da camada Ouro. Esses arquivos são material complementar — os dados completos e oficiais da solução residem nas tabelas Delta Lake do Databricks.</w:t>
+      </w:r>
+    </w:p>
+    <w:p>
+      <w:pPr>
+        <w:pStyle w:val="Heading2"/>
+        <w:spacing w:after="140" w:before="280"/>
+      </w:pPr>
+      <w:r>
+        <w:rPr>
+          <w:rFonts w:ascii="Arial" w:cs="Arial" w:eastAsia="Arial" w:hAnsi="Arial"/>
+          <w:b/>
+          <w:bCs/>
+          <w:color w:val="2E75B6"/>
+          <w:sz w:val="26"/>
+          <w:szCs w:val="26"/>
+        </w:rPr>
+        <w:t xml:space="preserve">10.1 Por que os CSVs foram gerados?</w:t>
+      </w:r>
+    </w:p>
+    <w:p>
+      <w:pPr>
+        <w:spacing w:after="120" w:before="80"/>
+      </w:pPr>
+      <w:r>
+        <w:rPr>
+          <w:rFonts w:ascii="Arial" w:cs="Arial" w:eastAsia="Arial" w:hAnsi="Arial"/>
+          <w:sz w:val="22"/>
+          <w:szCs w:val="22"/>
+        </w:rPr>
+        <w:t xml:space="preserve">As tabelas Ouro do projeto são Delta Lake — um formato proprietário do Databricks otimizado para consultas analíticas, mas que não pode ser aberto diretamente fora da plataforma. Para que os avaliadores pudessem visualizar os resultados sem precisar acessar o ambiente Databricks, as principais tabelas foram exportadas no formato CSV — um formato universal que pode ser aberto em qualquer editor de texto, Excel ou Google Sheets.</w:t>
+      </w:r>
+    </w:p>
+    <w:p>
+      <w:pPr>
+        <w:spacing w:after="120" w:before="80"/>
+      </w:pPr>
+      <w:r>
+        <w:rPr>
+          <w:rFonts w:ascii="Arial" w:cs="Arial" w:eastAsia="Arial" w:hAnsi="Arial"/>
+          <w:sz w:val="22"/>
+          <w:szCs w:val="22"/>
+        </w:rPr>
+        <w:t xml:space="preserve">Vale destacar que houve uma limitação técnica no processo de exportação: o Databricks Free Tier tem o DBFS (sistema de arquivos interno) desabilitado, o que impede salvar arquivos diretamente em disco. A solução foi converter as tabelas para Pandas (biblioteca Python para dados tabulares) e salvar em uma pasta temporária do sistema operacional, de onde foram baixadas manualmente e adicionadas ao repositório.</w:t>
+      </w:r>
+    </w:p>
+    <w:p>
+      <w:pPr>
+        <w:pStyle w:val="Heading2"/>
+        <w:spacing w:after="140" w:before="280"/>
+      </w:pPr>
+      <w:r>
+        <w:rPr>
+          <w:rFonts w:ascii="Arial" w:cs="Arial" w:eastAsia="Arial" w:hAnsi="Arial"/>
+          <w:b/>
+          <w:bCs/>
+          <w:color w:val="2E75B6"/>
+          <w:sz w:val="26"/>
+          <w:szCs w:val="26"/>
+        </w:rPr>
+        <w:t xml:space="preserve">10.2 Quais tabelas foram exportadas?</w:t>
+      </w:r>
+    </w:p>
+    <w:p>
+      <w:pPr>
+        <w:spacing w:after="120" w:before="80"/>
+      </w:pPr>
+      <w:r>
+        <w:rPr>
+          <w:rFonts w:ascii="Arial" w:cs="Arial" w:eastAsia="Arial" w:hAnsi="Arial"/>
+          <w:sz w:val="22"/>
+          <w:szCs w:val="22"/>
+        </w:rPr>
+        <w:t xml:space="preserve">Foram selecionadas as 9 tabelas Ouro mais representativas dos diferentes entregáveis do projeto, limitadas a 1.000 linhas cada para manter o tamanho dos arquivos razoável:</w:t>
+      </w:r>
+    </w:p>
+    <w:p>
+      <w:pPr>
+        <w:pStyle w:val="ListParagraph"/>
+        <w:numPr>
+          <w:ilvl w:val="0"/>
+          <w:numId w:val="1"/>
+        </w:numPr>
+        <w:spacing w:after="60" w:before="60"/>
+      </w:pPr>
+      <w:r>
+        <w:rPr>
+          <w:rFonts w:ascii="Arial" w:cs="Arial" w:eastAsia="Arial" w:hAnsi="Arial"/>
+          <w:sz w:val="22"/>
+          <w:szCs w:val="22"/>
+        </w:rPr>
+        <w:t xml:space="preserve">gold_frentes_membros — membros de frentes parlamentares com partido e UF</w:t>
+      </w:r>
+    </w:p>
+    <w:p>
+      <w:pPr>
+        <w:pStyle w:val="ListParagraph"/>
+        <w:numPr>
+          <w:ilvl w:val="0"/>
+          <w:numId w:val="1"/>
+        </w:numPr>
+        <w:spacing w:after="60" w:before="60"/>
+      </w:pPr>
+      <w:r>
+        <w:rPr>
+          <w:rFonts w:ascii="Arial" w:cs="Arial" w:eastAsia="Arial" w:hAnsi="Arial"/>
+          <w:sz w:val="22"/>
+          <w:szCs w:val="22"/>
+        </w:rPr>
+        <w:t xml:space="preserve">gold_diversidade_partidaria_frentes — índice de Herfindahl por frente</w:t>
+      </w:r>
+    </w:p>
+    <w:p>
+      <w:pPr>
+        <w:pStyle w:val="ListParagraph"/>
+        <w:numPr>
+          <w:ilvl w:val="0"/>
+          <w:numId w:val="1"/>
+        </w:numPr>
+        <w:spacing w:after="60" w:before="60"/>
+      </w:pPr>
+      <w:r>
+        <w:rPr>
+          <w:rFonts w:ascii="Arial" w:cs="Arial" w:eastAsia="Arial" w:hAnsi="Arial"/>
+          <w:sz w:val="22"/>
+          <w:szCs w:val="22"/>
+        </w:rPr>
+        <w:t xml:space="preserve">gold_deputados_multi_frentes — deputados com maior participação em frentes</w:t>
+      </w:r>
+    </w:p>
+    <w:p>
+      <w:pPr>
+        <w:pStyle w:val="ListParagraph"/>
+        <w:numPr>
+          <w:ilvl w:val="0"/>
+          <w:numId w:val="1"/>
+        </w:numPr>
+        <w:spacing w:after="60" w:before="60"/>
+      </w:pPr>
+      <w:r>
+        <w:rPr>
+          <w:rFonts w:ascii="Arial" w:cs="Arial" w:eastAsia="Arial" w:hAnsi="Arial"/>
+          <w:sz w:val="22"/>
+          <w:szCs w:val="22"/>
+        </w:rPr>
+        <w:t xml:space="preserve">gold_despesas_anomalias — despesas classificadas por Z-Score</w:t>
+      </w:r>
+    </w:p>
+    <w:p>
+      <w:pPr>
+        <w:pStyle w:val="ListParagraph"/>
+        <w:numPr>
+          <w:ilvl w:val="0"/>
+          <w:numId w:val="1"/>
+        </w:numPr>
+        <w:spacing w:after="60" w:before="60"/>
+      </w:pPr>
+      <w:r>
+        <w:rPr>
+          <w:rFonts w:ascii="Arial" w:cs="Arial" w:eastAsia="Arial" w:hAnsi="Arial"/>
+          <w:sz w:val="22"/>
+          <w:szCs w:val="22"/>
+        </w:rPr>
+        <w:t xml:space="preserve">gold_ranking_fornecedores — fornecedores com flags de suspeição</w:t>
+      </w:r>
+    </w:p>
+    <w:p>
+      <w:pPr>
+        <w:pStyle w:val="ListParagraph"/>
+        <w:numPr>
+          <w:ilvl w:val="0"/>
+          <w:numId w:val="1"/>
+        </w:numPr>
+        <w:spacing w:after="60" w:before="60"/>
+      </w:pPr>
+      <w:r>
+        <w:rPr>
+          <w:rFonts w:ascii="Arial" w:cs="Arial" w:eastAsia="Arial" w:hAnsi="Arial"/>
+          <w:sz w:val="22"/>
+          <w:szCs w:val="22"/>
+        </w:rPr>
+        <w:t xml:space="preserve">gold_relatorio_mensal_gasto_partido — top 10 partidos por gasto mensal</w:t>
+      </w:r>
+    </w:p>
+    <w:p>
+      <w:pPr>
+        <w:pStyle w:val="ListParagraph"/>
+        <w:numPr>
+          <w:ilvl w:val="0"/>
+          <w:numId w:val="1"/>
+        </w:numPr>
+        <w:spacing w:after="60" w:before="60"/>
+      </w:pPr>
+      <w:r>
+        <w:rPr>
+          <w:rFonts w:ascii="Arial" w:cs="Arial" w:eastAsia="Arial" w:hAnsi="Arial"/>
+          <w:sz w:val="22"/>
+          <w:szCs w:val="22"/>
+        </w:rPr>
+        <w:t xml:space="preserve">gold_monitor_engajamento — score de engajamento por deputado</w:t>
+      </w:r>
+    </w:p>
+    <w:p>
+      <w:pPr>
+        <w:pStyle w:val="ListParagraph"/>
+        <w:numPr>
+          <w:ilvl w:val="0"/>
+          <w:numId w:val="1"/>
+        </w:numPr>
+        <w:spacing w:after="60" w:before="60"/>
+      </w:pPr>
+      <w:r>
+        <w:rPr>
+          <w:rFonts w:ascii="Arial" w:cs="Arial" w:eastAsia="Arial" w:hAnsi="Arial"/>
+          <w:sz w:val="22"/>
+          <w:szCs w:val="22"/>
+        </w:rPr>
+        <w:t xml:space="preserve">gold_coesao_votacao_frentes — índice de coesão de voto por frente</w:t>
+      </w:r>
+    </w:p>
+    <w:p>
+      <w:pPr>
+        <w:pStyle w:val="ListParagraph"/>
+        <w:numPr>
+          <w:ilvl w:val="0"/>
+          <w:numId w:val="1"/>
+        </w:numPr>
+        <w:spacing w:after="60" w:before="60"/>
+      </w:pPr>
+      <w:r>
+        <w:rPr>
+          <w:rFonts w:ascii="Arial" w:cs="Arial" w:eastAsia="Arial" w:hAnsi="Arial"/>
+          <w:sz w:val="22"/>
+          <w:szCs w:val="22"/>
+        </w:rPr>
+        <w:t xml:space="preserve">gold_cpis_timeline — linha do tempo das CPIs encontradas</w:t>
+      </w:r>
+    </w:p>
+    <w:p>
+      <w:pPr>
+        <w:spacing w:after="120" w:before="120"/>
+      </w:pPr>
+      <w:r>
+        <w:rPr>
+          <w:rFonts w:ascii="Arial" w:cs="Arial" w:eastAsia="Arial" w:hAnsi="Arial"/>
+          <w:sz w:val="22"/>
+          <w:szCs w:val="22"/>
+          <w:i/>
+          <w:iCs/>
+          <w:color w:val="595959"/>
+        </w:rPr>
+        <w:t xml:space="preserve">Os dados completos de todas as 21 tabelas Ouro estão disponíveis diretamente no Databricks em workspace.ouro_camara.*, podendo ser consultados via SQL Editor ou pelos notebooks da camada Ouro.</w:t>
       </w:r>
     </w:p>
     <w:sectPr>

</xml_diff>